<commit_message>
docs: update user manual (DockWatch User Manual.pdf, 사용메뉴얼.docx)
</commit_message>
<xml_diff>
--- a/사용메뉴얼.docx
+++ b/사용메뉴얼.docx
@@ -2271,9 +2271,6 @@
           <w:bottom w:val="single" w:sz="6" w:space="1" w:color="E2E8F0"/>
         </w:pBdr>
         <w:spacing w:before="120" w:after="120"/>
-        <w:rPr>
-          <w:rFonts w:hint="eastAsia"/>
-        </w:rPr>
       </w:pPr>
     </w:p>
     <w:p>
@@ -3568,9 +3565,6 @@
       <w:pPr>
         <w:spacing w:before="60" w:after="80"/>
         <w:jc w:val="both"/>
-        <w:rPr>
-          <w:rFonts w:hint="eastAsia"/>
-        </w:rPr>
       </w:pPr>
       <w:proofErr w:type="gramStart"/>
       <w:r>
@@ -4006,7 +4000,7 @@
         <w:spacing w:before="120" w:after="120" w:line="260" w:lineRule="auto"/>
         <w:ind w:left="200" w:right="200"/>
         <w:rPr>
-          <w:rFonts w:ascii="Consolas" w:hAnsi="Consolas" w:hint="eastAsia"/>
+          <w:rFonts w:ascii="Consolas" w:hAnsi="Consolas"/>
           <w:color w:val="1E293B"/>
           <w:sz w:val="18"/>
         </w:rPr>
@@ -4180,7 +4174,7 @@
         <w:spacing w:before="120" w:after="120" w:line="260" w:lineRule="auto"/>
         <w:ind w:left="200" w:right="200"/>
         <w:rPr>
-          <w:rFonts w:ascii="Consolas" w:hAnsi="Consolas" w:hint="eastAsia"/>
+          <w:rFonts w:ascii="Consolas" w:hAnsi="Consolas"/>
           <w:color w:val="1E293B"/>
           <w:sz w:val="18"/>
         </w:rPr>
@@ -4286,7 +4280,7 @@
         <w:spacing w:before="120" w:after="120" w:line="260" w:lineRule="auto"/>
         <w:ind w:left="200" w:right="200"/>
         <w:rPr>
-          <w:rFonts w:ascii="Consolas" w:hAnsi="Consolas" w:hint="eastAsia"/>
+          <w:rFonts w:ascii="Consolas" w:hAnsi="Consolas"/>
           <w:color w:val="1E293B"/>
           <w:sz w:val="18"/>
         </w:rPr>
@@ -4511,9 +4505,6 @@
       <w:pPr>
         <w:spacing w:before="60" w:after="80"/>
         <w:jc w:val="both"/>
-        <w:rPr>
-          <w:rFonts w:hint="eastAsia"/>
-        </w:rPr>
       </w:pPr>
       <w:proofErr w:type="gramStart"/>
       <w:r>
@@ -5075,7 +5066,7 @@
         <w:spacing w:before="120" w:after="120" w:line="260" w:lineRule="auto"/>
         <w:ind w:left="200" w:right="200"/>
         <w:rPr>
-          <w:rFonts w:ascii="Consolas" w:hAnsi="Consolas" w:hint="eastAsia"/>
+          <w:rFonts w:ascii="Consolas" w:hAnsi="Consolas"/>
           <w:color w:val="1E293B"/>
           <w:sz w:val="18"/>
         </w:rPr>
@@ -5486,18 +5477,16 @@
         </w:rPr>
         <w:t xml:space="preserve">웹 브라우저를 열고 </w:t>
       </w:r>
-      <w:hyperlink r:id="rId6" w:history="1">
-        <w:r>
-          <w:rPr>
-            <w:rStyle w:val="a5"/>
-            <w:rFonts w:ascii="Consolas" w:eastAsia="맑은 고딕" w:hAnsi="Consolas"/>
-            <w:sz w:val="19"/>
-            <w:szCs w:val="19"/>
-            <w:shd w:val="clear" w:color="auto" w:fill="F9F2F4"/>
-          </w:rPr>
-          <w:t>http://Host</w:t>
-        </w:r>
-      </w:hyperlink>
+      <w:r>
+        <w:rPr>
+          <w:rFonts w:ascii="Consolas" w:eastAsia="맑은 고딕" w:hAnsi="Consolas"/>
+          <w:color w:val="C00000"/>
+          <w:sz w:val="19"/>
+          <w:szCs w:val="19"/>
+          <w:shd w:val="clear" w:color="auto" w:fill="F9F2F4"/>
+        </w:rPr>
+        <w:t>http://Host</w:t>
+      </w:r>
       <w:r>
         <w:rPr>
           <w:rFonts w:ascii="Consolas" w:eastAsia="맑은 고딕" w:hAnsi="Consolas" w:hint="eastAsia"/>
@@ -5623,72 +5612,7 @@
           <w:szCs w:val="19"/>
           <w:shd w:val="clear" w:color="auto" w:fill="F9F2F4"/>
         </w:rPr>
-        <w:t>ADMIN_PASSWORD</w:t>
-      </w:r>
-      <w:r>
-        <w:rPr>
-          <w:rFonts w:ascii="맑은 고딕" w:eastAsia="맑은 고딕" w:hAnsi="맑은 고딕"/>
-          <w:color w:val="333333"/>
-          <w:sz w:val="21"/>
-          <w:szCs w:val="21"/>
-        </w:rPr>
-        <w:t xml:space="preserve"> (기본</w:t>
-      </w:r>
-      <w:r>
-        <w:rPr>
-          <w:rFonts w:ascii="맑은 고딕" w:eastAsia="맑은 고딕" w:hAnsi="맑은 고딕" w:hint="eastAsia"/>
-          <w:color w:val="333333"/>
-          <w:sz w:val="21"/>
-          <w:szCs w:val="21"/>
-        </w:rPr>
-        <w:t xml:space="preserve"> docker-</w:t>
-      </w:r>
-      <w:proofErr w:type="spellStart"/>
-      <w:r>
-        <w:rPr>
-          <w:rFonts w:ascii="맑은 고딕" w:eastAsia="맑은 고딕" w:hAnsi="맑은 고딕" w:hint="eastAsia"/>
-          <w:color w:val="333333"/>
-          <w:sz w:val="21"/>
-          <w:szCs w:val="21"/>
-        </w:rPr>
-        <w:t>compose.yml</w:t>
-      </w:r>
-      <w:proofErr w:type="spellEnd"/>
-      <w:r>
-        <w:rPr>
-          <w:rFonts w:ascii="맑은 고딕" w:eastAsia="맑은 고딕" w:hAnsi="맑은 고딕" w:hint="eastAsia"/>
-          <w:color w:val="333333"/>
-          <w:sz w:val="21"/>
-          <w:szCs w:val="21"/>
-        </w:rPr>
-        <w:t xml:space="preserve"> </w:t>
-      </w:r>
-      <w:r>
-        <w:rPr>
-          <w:rFonts w:ascii="맑은 고딕" w:eastAsia="맑은 고딕" w:hAnsi="맑은 고딕"/>
-          <w:color w:val="333333"/>
-          <w:sz w:val="21"/>
-          <w:szCs w:val="21"/>
-        </w:rPr>
-        <w:t>이용</w:t>
-      </w:r>
-      <w:r>
-        <w:rPr>
-          <w:rFonts w:ascii="맑은 고딕" w:eastAsia="맑은 고딕" w:hAnsi="맑은 고딕" w:hint="eastAsia"/>
-          <w:color w:val="333333"/>
-          <w:sz w:val="21"/>
-          <w:szCs w:val="21"/>
-        </w:rPr>
-        <w:t xml:space="preserve"> 시 기본</w:t>
-      </w:r>
-      <w:r>
-        <w:rPr>
-          <w:rFonts w:ascii="맑은 고딕" w:eastAsia="맑은 고딕" w:hAnsi="맑은 고딕"/>
-          <w:color w:val="333333"/>
-          <w:sz w:val="21"/>
-          <w:szCs w:val="21"/>
-        </w:rPr>
-        <w:t xml:space="preserve">값: </w:t>
+        <w:t>ADMIN_</w:t>
       </w:r>
       <w:proofErr w:type="gramStart"/>
       <w:r>
@@ -5699,16 +5623,16 @@
           <w:szCs w:val="19"/>
           <w:shd w:val="clear" w:color="auto" w:fill="F9F2F4"/>
         </w:rPr>
-        <w:t>admin</w:t>
-      </w:r>
-      <w:r>
-        <w:rPr>
-          <w:rFonts w:ascii="맑은 고딕" w:eastAsia="맑은 고딕" w:hAnsi="맑은 고딕"/>
-          <w:color w:val="333333"/>
-          <w:sz w:val="21"/>
-          <w:szCs w:val="21"/>
-        </w:rPr>
-        <w:t xml:space="preserve"> /</w:t>
+        <w:t>PASSWORD</w:t>
+      </w:r>
+      <w:r>
+        <w:rPr>
+          <w:rFonts w:ascii="맑은 고딕" w:eastAsia="맑은 고딕" w:hAnsi="맑은 고딕"/>
+          <w:color w:val="333333"/>
+          <w:sz w:val="21"/>
+          <w:szCs w:val="21"/>
+        </w:rPr>
+        <w:t xml:space="preserve"> 를</w:t>
       </w:r>
       <w:proofErr w:type="gramEnd"/>
       <w:r>
@@ -5718,26 +5642,7 @@
           <w:sz w:val="21"/>
           <w:szCs w:val="21"/>
         </w:rPr>
-        <w:t xml:space="preserve"> </w:t>
-      </w:r>
-      <w:r>
-        <w:rPr>
-          <w:rFonts w:ascii="Consolas" w:eastAsia="맑은 고딕" w:hAnsi="Consolas"/>
-          <w:color w:val="C7254E"/>
-          <w:sz w:val="19"/>
-          <w:szCs w:val="19"/>
-          <w:shd w:val="clear" w:color="auto" w:fill="F9F2F4"/>
-        </w:rPr>
-        <w:t>admin123</w:t>
-      </w:r>
-      <w:r>
-        <w:rPr>
-          <w:rFonts w:ascii="맑은 고딕" w:eastAsia="맑은 고딕" w:hAnsi="맑은 고딕"/>
-          <w:color w:val="333333"/>
-          <w:sz w:val="21"/>
-          <w:szCs w:val="21"/>
-        </w:rPr>
-        <w:t>)를 입력하여 로그인합니다.</w:t>
+        <w:t xml:space="preserve"> 입력하여 로그인합니다.</w:t>
       </w:r>
     </w:p>
     <w:p>
@@ -6482,6 +6387,9 @@
         </w:pict>
       </w:r>
       <w:r>
+        <w:rPr>
+          <w:noProof/>
+        </w:rPr>
         <w:drawing>
           <wp:inline distT="0" distB="0" distL="0" distR="0" wp14:anchorId="1A246368" wp14:editId="103F51EA">
             <wp:extent cx="5731510" cy="2041525"/>
@@ -6498,7 +6406,7 @@
                     <pic:cNvPicPr/>
                   </pic:nvPicPr>
                   <pic:blipFill>
-                    <a:blip r:embed="rId7"/>
+                    <a:blip r:embed="rId6"/>
                     <a:stretch>
                       <a:fillRect/>
                     </a:stretch>
@@ -6550,6 +6458,9 @@
         <w:spacing w:before="120" w:after="120"/>
       </w:pPr>
       <w:r>
+        <w:rPr>
+          <w:noProof/>
+        </w:rPr>
         <w:lastRenderedPageBreak/>
         <w:drawing>
           <wp:inline distT="0" distB="0" distL="0" distR="0" wp14:anchorId="28654E57" wp14:editId="517B2EF4">
@@ -6567,7 +6478,7 @@
                     <pic:cNvPicPr/>
                   </pic:nvPicPr>
                   <pic:blipFill>
-                    <a:blip r:embed="rId8"/>
+                    <a:blip r:embed="rId7"/>
                     <a:stretch>
                       <a:fillRect/>
                     </a:stretch>
@@ -7185,6 +7096,9 @@
         <w:spacing w:before="120" w:after="120"/>
       </w:pPr>
       <w:r>
+        <w:rPr>
+          <w:noProof/>
+        </w:rPr>
         <w:drawing>
           <wp:inline distT="0" distB="0" distL="0" distR="0" wp14:anchorId="4A8A4D98" wp14:editId="36CF9FC1">
             <wp:extent cx="4448796" cy="1790950"/>
@@ -7201,7 +7115,7 @@
                     <pic:cNvPicPr/>
                   </pic:nvPicPr>
                   <pic:blipFill>
-                    <a:blip r:embed="rId9"/>
+                    <a:blip r:embed="rId8"/>
                     <a:stretch>
                       <a:fillRect/>
                     </a:stretch>
@@ -7253,6 +7167,9 @@
         <w:spacing w:before="120" w:after="120"/>
       </w:pPr>
       <w:r>
+        <w:rPr>
+          <w:noProof/>
+        </w:rPr>
         <w:drawing>
           <wp:inline distT="0" distB="0" distL="0" distR="0" wp14:anchorId="047F68A3" wp14:editId="26DDD74F">
             <wp:extent cx="4401164" cy="4048690"/>
@@ -7269,7 +7186,7 @@
                     <pic:cNvPicPr/>
                   </pic:nvPicPr>
                   <pic:blipFill>
-                    <a:blip r:embed="rId10"/>
+                    <a:blip r:embed="rId9"/>
                     <a:stretch>
                       <a:fillRect/>
                     </a:stretch>
@@ -7293,9 +7210,6 @@
     <w:p>
       <w:pPr>
         <w:pStyle w:val="a7"/>
-        <w:rPr>
-          <w:rFonts w:hint="eastAsia"/>
-        </w:rPr>
       </w:pPr>
       <w:r>
         <w:t xml:space="preserve">Figure </w:t>
@@ -7689,6 +7603,9 @@
         <w:spacing w:before="120" w:after="120"/>
       </w:pPr>
       <w:r>
+        <w:rPr>
+          <w:noProof/>
+        </w:rPr>
         <w:drawing>
           <wp:inline distT="0" distB="0" distL="0" distR="0" wp14:anchorId="7F801365" wp14:editId="54F840F7">
             <wp:extent cx="5731510" cy="1797685"/>
@@ -7705,7 +7622,7 @@
                     <pic:cNvPicPr/>
                   </pic:nvPicPr>
                   <pic:blipFill>
-                    <a:blip r:embed="rId11"/>
+                    <a:blip r:embed="rId10"/>
                     <a:stretch>
                       <a:fillRect/>
                     </a:stretch>
@@ -7754,9 +7671,6 @@
           <w:bottom w:val="single" w:sz="6" w:space="1" w:color="E2E8F0"/>
         </w:pBdr>
         <w:spacing w:before="120" w:after="120"/>
-        <w:rPr>
-          <w:rFonts w:hint="eastAsia"/>
-        </w:rPr>
       </w:pPr>
     </w:p>
     <w:p>
@@ -7896,6 +7810,9 @@
         <w:spacing w:before="120" w:after="120"/>
       </w:pPr>
       <w:r>
+        <w:rPr>
+          <w:noProof/>
+        </w:rPr>
         <w:lastRenderedPageBreak/>
         <w:drawing>
           <wp:inline distT="0" distB="0" distL="0" distR="0" wp14:anchorId="31DADDBE" wp14:editId="1733D25C">
@@ -7913,7 +7830,7 @@
                     <pic:cNvPicPr/>
                   </pic:nvPicPr>
                   <pic:blipFill>
-                    <a:blip r:embed="rId12"/>
+                    <a:blip r:embed="rId11"/>
                     <a:stretch>
                       <a:fillRect/>
                     </a:stretch>
@@ -7968,9 +7885,6 @@
           <w:bottom w:val="single" w:sz="6" w:space="1" w:color="E2E8F0"/>
         </w:pBdr>
         <w:spacing w:before="120" w:after="120"/>
-        <w:rPr>
-          <w:rFonts w:hint="eastAsia"/>
-        </w:rPr>
       </w:pPr>
     </w:p>
     <w:p>
@@ -8119,6 +8033,9 @@
         <w:spacing w:before="120" w:after="120"/>
       </w:pPr>
       <w:r>
+        <w:rPr>
+          <w:noProof/>
+        </w:rPr>
         <w:drawing>
           <wp:inline distT="0" distB="0" distL="0" distR="0" wp14:anchorId="3DB14881" wp14:editId="531D94D5">
             <wp:extent cx="5731510" cy="1865630"/>
@@ -8135,7 +8052,7 @@
                     <pic:cNvPicPr/>
                   </pic:nvPicPr>
                   <pic:blipFill>
-                    <a:blip r:embed="rId13"/>
+                    <a:blip r:embed="rId12"/>
                     <a:stretch>
                       <a:fillRect/>
                     </a:stretch>
@@ -8159,9 +8076,6 @@
     <w:p>
       <w:pPr>
         <w:pStyle w:val="a7"/>
-        <w:rPr>
-          <w:rFonts w:hint="eastAsia"/>
-        </w:rPr>
       </w:pPr>
       <w:r>
         <w:t xml:space="preserve">Figure </w:t>
@@ -8187,9 +8101,6 @@
           <w:bottom w:val="single" w:sz="6" w:space="1" w:color="E2E8F0"/>
         </w:pBdr>
         <w:spacing w:before="120" w:after="120"/>
-        <w:rPr>
-          <w:rFonts w:hint="eastAsia"/>
-        </w:rPr>
       </w:pPr>
     </w:p>
     <w:p>
@@ -9008,7 +8919,7 @@
         <w:spacing w:before="60" w:after="60"/>
         <w:ind w:left="400" w:hanging="260"/>
         <w:rPr>
-          <w:rFonts w:ascii="맑은 고딕" w:eastAsia="맑은 고딕" w:hAnsi="맑은 고딕" w:hint="eastAsia"/>
+          <w:rFonts w:ascii="맑은 고딕" w:eastAsia="맑은 고딕" w:hAnsi="맑은 고딕"/>
           <w:color w:val="333333"/>
           <w:sz w:val="21"/>
           <w:szCs w:val="21"/>
@@ -9263,9 +9174,6 @@
       <w:pPr>
         <w:spacing w:before="40" w:after="40"/>
         <w:ind w:left="360" w:hanging="200"/>
-        <w:rPr>
-          <w:rFonts w:hint="eastAsia"/>
-        </w:rPr>
       </w:pPr>
       <w:r>
         <w:rPr>

</xml_diff>